<commit_message>
docs: align IAM examples with Eindinspectie and BH18
</commit_message>
<xml_diff>
--- a/docs/management/Future-Factory-vervolgdocument-2-IAM-EDF.docx
+++ b/docs/management/Future-Factory-vervolgdocument-2-IAM-EDF.docx
@@ -32,7 +32,7 @@
     </w:p>
     <w:p>
       <w:r>
-        <w:t>Naarmate Future Factory meer machines, medewerkers en processen ondersteunt, wordt deze inrichting belangrijker. Een operator, planner, kwaliteitsmedewerker en technisch beheerder hebben verschillende taken. Zij hebben daarom ook verschillende toegang nodig. Hetzelfde geldt voor een tablet bij BH16 en een automatisch proces dat labels afhandelt.</w:t>
+        <w:t>Naarmate Future Factory meer machines, medewerkers en processen ondersteunt, wordt deze inrichting belangrijker. Een operator, planner, kwaliteitsmedewerker en technisch beheerder hebben verschillende taken. Zij hebben daarom ook verschillende toegang nodig. Hetzelfde geldt voor een tablet bij BH18 en een automatisch proces dat labels afhandelt.</w:t>
       </w:r>
     </w:p>
     <w:p>
@@ -282,7 +282,7 @@
               <w:rPr>
                 <w:sz w:val="19"/>
               </w:rPr>
-              <w:t>Bijvoorbeeld alleen bij BH16, binnen Fittings of voor een bepaalde groep machines.</w:t>
+              <w:t>Bijvoorbeeld alleen bij BH18, binnen Fittings of voor een bepaalde groep machines.</w:t>
             </w:r>
           </w:p>
         </w:tc>
@@ -684,7 +684,7 @@
               <w:rPr>
                 <w:sz w:val="19"/>
               </w:rPr>
-              <w:t>De tablet is verbonden aan de werkplek BH16.</w:t>
+              <w:t>De tablet is verbonden aan de werkplek BH18.</w:t>
             </w:r>
           </w:p>
         </w:tc>
@@ -777,7 +777,7 @@
     </w:p>
     <w:p>
       <w:r>
-        <w:t>Een tablet kan de hele dag bij dezelfde machine staan, terwijl meerdere medewerkers elkaar afwisselen. Alleen vastleggen dat “BH16” iets heeft gedaan, vertelt dan niet welke medewerker de productie heeft gestart of gereedgemeld. Het P14-model maakt daarom onderscheid tussen de machine-identiteit en de medewerker die op dat moment handelt.</w:t>
+        <w:t>Een tablet kan de hele dag bij dezelfde machine staan, terwijl meerdere medewerkers elkaar afwisselen. Alleen vastleggen dat “BH18” iets heeft gedaan, vertelt dan niet welke medewerker de productie heeft gestart of gereedgemeld. Het P14-model maakt daarom onderscheid tussen de machine-identiteit en de medewerker die op dat moment handelt.</w:t>
       </w:r>
     </w:p>
     <w:p>
@@ -787,7 +787,7 @@
     </w:p>
     <w:p>
       <w:r>
-        <w:t>Een voorbeeld: operator A begint een order op BH16. Later neemt operator B het werk over. De machine blijft BH16, maar de verantwoordelijke persoon voor nieuwe registraties verandert. De eerdere handelingen van A moeten herkenbaar blijven als handelingen van A.</w:t>
+        <w:t>Een voorbeeld: operator A begint een order op BH18. Later neemt operator B het werk over. De machine blijft BH18, maar de verantwoordelijke persoon voor nieuwe registraties verandert. De eerdere handelingen van A moeten herkenbaar blijven als handelingen van A.</w:t>
       </w:r>
     </w:p>
     <w:p>
@@ -1244,7 +1244,7 @@
               <w:rPr>
                 <w:sz w:val="19"/>
               </w:rPr>
-              <w:t>Productie registreren bij BH16, zonder daarmee toegang tot alle machines te krijgen.</w:t>
+              <w:t>Productie registreren bij BH18, zonder daarmee toegang tot alle machines te krijgen.</w:t>
             </w:r>
           </w:p>
         </w:tc>
@@ -1355,7 +1355,7 @@
     </w:p>
     <w:p>
       <w:r>
-        <w:t>Het recht om productie te registreren zegt nog niet op welke machine dat mag. Daarvoor dient het werkgebied. Denk aan toestemming voor BH16, een groep vergelijkbare machines of een afdeling. Dit voorkomt dat uitbreiding van Future Factory vanzelf toegang tot iedere nieuwe werkplek oplevert.</w:t>
+        <w:t>Het recht om productie te registreren zegt nog niet op welke machine dat mag. Daarvoor dient het werkgebied. Denk aan toestemming voor BH18, een groep vergelijkbare machines of een afdeling. Dit voorkomt dat uitbreiding van Future Factory vanzelf toegang tot iedere nieuwe werkplek oplevert.</w:t>
       </w:r>
     </w:p>
     <w:p>
@@ -1368,7 +1368,7 @@
     </w:p>
     <w:p>
       <w:r>
-        <w:t>Een operator kan toestemming hebben om producten op BM01 gereed te melden. Voor EDF-producten geldt in dit voorbeeld een extra voorwaarde: een geldige EDF-certificering. Zonder die certificering mag de operator gewone producten wel gereedmelden, maar EDF-producten niet. Het algemene machinerecht en de productgebonden certificering moeten dus beide kloppen.</w:t>
+        <w:t>Een operator kan toestemming hebben om producten op Eindinspectie gereed te melden. Voor EDF-producten geldt in dit voorbeeld een extra voorwaarde: een geldige EDF-certificering. Zonder die certificering mag de operator gewone producten wel gereedmelden, maar EDF-producten niet. Het algemene machinerecht en de productgebonden certificering moeten dus beide kloppen.</w:t>
       </w:r>
     </w:p>
     <w:p>
@@ -1824,17 +1824,17 @@
         <w:pStyle w:val="Heading1"/>
       </w:pPr>
       <w:r>
-        <w:t>Voorbeeld EDF producten op BM01</w:t>
+        <w:t>Voorbeeld EDF producten op Eindinspectie</w:t>
       </w:r>
     </w:p>
     <w:p>
       <w:r>
-        <w:t>Een operator is aangemeld op BM01 en heeft het recht om producten gereed te melden. Bij een product waarvoor geen EDF-certificering nodig is, kan dat doorgaan als ook de overige controles kloppen. Het systeem kijkt dus naar zowel de medewerker als het betreffende product.</w:t>
+        <w:t>Een operator is aangemeld op Eindinspectie en heeft het recht om producten gereed te melden. Bij een product waarvoor geen EDF-certificering nodig is, kan dat doorgaan als ook de overige controles kloppen. Het systeem kijkt dus naar zowel de medewerker als het betreffende product.</w:t>
       </w:r>
     </w:p>
     <w:p>
       <w:r>
-        <w:t>Bij een EDF-product is hetzelfde machinerecht niet voldoende. Ontbreekt een geldige EDF-certificering bij deze operator, dan moet Future Factory de gereedmelding tegenhouden. Een begrijpelijke melding is bijvoorbeeld: “Je mag op BM01 gereedmelden, maar voor dit product is een geldige EDF-certificering nodig.”</w:t>
+        <w:t>Bij een EDF-product is hetzelfde machinerecht niet voldoende. Ontbreekt een geldige EDF-certificering bij deze operator, dan moet Future Factory de gereedmelding tegenhouden. Een begrijpelijke melding is bijvoorbeeld: “Je mag op Eindinspectie gereedmelden, maar voor dit product is een geldige EDF-certificering nodig.”</w:t>
       </w:r>
     </w:p>
     <w:p>
@@ -2866,7 +2866,7 @@
               <w:rPr>
                 <w:sz w:val="19"/>
               </w:rPr>
-              <w:t>Operators toevoegen en hun inzet en toegang voor het werk organiseren, bijvoorbeeld gereedmelden op BM01.</w:t>
+              <w:t>Operators toevoegen en hun inzet en toegang voor het werk organiseren, bijvoorbeeld gereedmelden op Eindinspectie.</w:t>
             </w:r>
           </w:p>
         </w:tc>
@@ -2967,7 +2967,7 @@
               <w:rPr>
                 <w:sz w:val="19"/>
               </w:rPr>
-              <w:t>De certificering vervangt niet de benodigde toegang tot BM01 of het recht om gereed te melden.</w:t>
+              <w:t>De certificering vervangt niet de benodigde toegang tot Eindinspectie of het recht om gereed te melden.</w:t>
             </w:r>
           </w:p>
         </w:tc>
@@ -2988,7 +2988,7 @@
     </w:p>
     <w:p>
       <w:r>
-        <w:t>Stap 2. De Teamleader of Production Manager voegt de medewerker als operator toe en organiseert de passende machinetoegang. In dit voorbeeld krijgt de operator toestemming om op BM01 producten gereed te melden. Die toestemming geldt binnen het toegewezen werkgebied.</w:t>
+        <w:t>Stap 2. De Teamleader of Production Manager voegt de medewerker als operator toe en organiseert de passende machinetoegang. In dit voorbeeld krijgt de operator toestemming om op Eindinspectie producten gereed te melden. Die toestemming geldt binnen het toegewezen werkgebied.</w:t>
       </w:r>
     </w:p>
     <w:p>
@@ -2998,7 +2998,7 @@
     </w:p>
     <w:p>
       <w:r>
-        <w:t>Stap 4. Bij iedere gereedmelding van een EDF-product controleert Future Factory of zowel het recht voor BM01 als de vereiste EDF-certificering geldig is. Ook de actieve operatorsessie en de overige procesvoorwaarden moeten kloppen. Ontbreekt één van deze voorwaarden, dan mag de handeling niet doorgaan.</w:t>
+        <w:t>Stap 4. Bij iedere gereedmelding van een EDF-product controleert Future Factory of zowel het recht voor Eindinspectie als de vereiste EDF-certificering geldig is. Ook de actieve operatorsessie en de overige procesvoorwaarden moeten kloppen. Ontbreekt één van deze voorwaarden, dan mag de handeling niet doorgaan.</w:t>
       </w:r>
     </w:p>
     <w:p>
@@ -3026,6 +3026,7 @@
     </w:p>
     <w:sectPr>
       <w:footerReference w:type="default" r:id="rId9"/>
+      <w:headerReference w:type="default" r:id="rId10"/>
       <w:pgSz w:w="11906" w:h="16838"/>
       <w:pgMar w:top="964" w:right="1077" w:bottom="907" w:left="1077" w:header="720" w:footer="720" w:gutter="0"/>
       <w:cols w:space="720"/>
@@ -3051,6 +3052,16 @@
     <w:fldSimple w:instr="PAGE"/>
   </w:p>
 </w:ftr>
+</file>
+
+<file path=word/header1.xml><?xml version="1.0" encoding="utf-8"?>
+<w:hdr xmlns:m="http://schemas.openxmlformats.org/officeDocument/2006/math" xmlns:mc="http://schemas.openxmlformats.org/markup-compatibility/2006" xmlns:mo="http://schemas.microsoft.com/office/mac/office/2008/main" xmlns:mv="urn:schemas-microsoft-com:mac:vml" xmlns:o="urn:schemas-microsoft-com:office:office" xmlns:r="http://schemas.openxmlformats.org/officeDocument/2006/relationships" xmlns:v="urn:schemas-microsoft-com:vml" xmlns:w10="urn:schemas-microsoft-com:office:word" xmlns:w14="http://schemas.microsoft.com/office/word/2010/wordml" xmlns:w="http://schemas.openxmlformats.org/wordprocessingml/2006/main" xmlns:wne="http://schemas.microsoft.com/office/word/2006/wordml" xmlns:wp14="http://schemas.microsoft.com/office/word/2010/wordprocessingDrawing" xmlns:wp="http://schemas.openxmlformats.org/drawingml/2006/wordprocessingDrawing" xmlns:wpc="http://schemas.microsoft.com/office/word/2010/wordprocessingCanvas" xmlns:wpg="http://schemas.microsoft.com/office/word/2010/wordprocessingGroup" xmlns:wpi="http://schemas.microsoft.com/office/word/2010/wordprocessingInk" xmlns:wps="http://schemas.microsoft.com/office/word/2010/wordprocessingShape" mc:Ignorable="w14 wp14">
+  <w:p>
+    <w:pPr>
+      <w:pStyle w:val="Header"/>
+    </w:pPr>
+  </w:p>
+</w:hdr>
 </file>
 
 <file path=word/numbering.xml><?xml version="1.0" encoding="utf-8"?>

</xml_diff>

<commit_message>
docs: generalize IAM certification example
</commit_message>
<xml_diff>
--- a/docs/management/Future-Factory-vervolgdocument-2-IAM-EDF.docx
+++ b/docs/management/Future-Factory-vervolgdocument-2-IAM-EDF.docx
@@ -3024,6 +3024,11 @@
         <w:t>Naast IAM binnen de applicatie bestaat toegangsbeheer van de cloudomgeving zelf. Dat bepaalt bijvoorbeeld wie de centrale software mag beheren en welke automatische processen bij gegevens kunnen. Deze technische toegang hangt samen met bedrijfsbeheer, maar is iets anders dan de toestemming van een operator om productie gereed te melden.</w:t>
       </w:r>
     </w:p>
+    <w:p>
+      <w:r>
+        <w:t>Opmerking over certificeringen: EDF is in dit document een voorbeeld. Hetzelfde principe geldt voor andere certificeringen die aan een medewerker gekoppeld kunnen worden. Als Future Factory bijvoorbeeld wordt uitgerold naar spoolbouw, kunnen daar de geldende certificeringen worden toegevoegd, waaronder certificeringen die iedere twee jaar opnieuw moeten worden beoordeeld of verlengd. Het systeem kan dan per proces controleren of de juiste certificering nog geldig is.</w:t>
+      </w:r>
+    </w:p>
     <w:sectPr>
       <w:footerReference w:type="default" r:id="rId9"/>
       <w:headerReference w:type="default" r:id="rId10"/>

</xml_diff>